<commit_message>
Updated Chapter 4 spatial scripts with labeled roads and coordinate grids
</commit_message>
<xml_diff>
--- a/Enugu_Dissertation_Statistical_Tables.docx
+++ b/Enugu_Dissertation_Statistical_Tables.docx
@@ -219,6 +219,7 @@
       <w:pPr>
         <w:pStyle w:val="Heading2"/>
       </w:pPr>
+      <w:bookmarkStart w:id="0" w:name="_Hlk240617706"/>
       <w:r>
         <w:t>2. Model Validation Metrics (2024)</w:t>
       </w:r>
@@ -228,31 +229,36 @@
         <w:t>The tables below detail the performance of the Convolutional Neural Network (CNN) against the 2024 ground truth data for high-resolution Land Use/Land Cover (LULC) and Urban Heat Island (UHI) mapping.</w:t>
       </w:r>
     </w:p>
+    <w:p/>
     <w:p>
       <w:pPr>
         <w:pStyle w:val="Heading3"/>
       </w:pPr>
       <w:r>
+        <w:lastRenderedPageBreak/>
         <w:t>Table 2.1: LULC Classification Accuracy</w:t>
       </w:r>
     </w:p>
     <w:tbl>
       <w:tblPr>
         <w:tblStyle w:val="TableGrid"/>
-        <w:tblW w:w="0" w:type="auto"/>
+        <w:tblW w:w="9370" w:type="dxa"/>
         <w:tblLook w:val="04A0" w:firstRow="1" w:lastRow="0" w:firstColumn="1" w:lastColumn="0" w:noHBand="0" w:noVBand="1"/>
       </w:tblPr>
       <w:tblGrid>
-        <w:gridCol w:w="1728"/>
-        <w:gridCol w:w="1728"/>
-        <w:gridCol w:w="1728"/>
-        <w:gridCol w:w="1728"/>
-        <w:gridCol w:w="1728"/>
+        <w:gridCol w:w="1874"/>
+        <w:gridCol w:w="1874"/>
+        <w:gridCol w:w="1874"/>
+        <w:gridCol w:w="1874"/>
+        <w:gridCol w:w="1874"/>
       </w:tblGrid>
       <w:tr>
+        <w:trPr>
+          <w:trHeight w:val="744"/>
+        </w:trPr>
         <w:tc>
           <w:tcPr>
-            <w:tcW w:w="1728" w:type="dxa"/>
+            <w:tcW w:w="1874" w:type="dxa"/>
           </w:tcPr>
           <w:p>
             <w:r>
@@ -265,41 +271,33 @@
         </w:tc>
         <w:tc>
           <w:tcPr>
-            <w:tcW w:w="1728" w:type="dxa"/>
+            <w:tcW w:w="1874" w:type="dxa"/>
           </w:tcPr>
           <w:p>
             <w:r>
               <w:rPr>
                 <w:b/>
               </w:rPr>
-              <w:t xml:space="preserve">Producer Acc </w:t>
-            </w:r>
-            <w:r>
-              <w:rPr>
-                <w:b/>
-              </w:rPr>
-              <w:lastRenderedPageBreak/>
-              <w:t>(%)</w:t>
+              <w:t>Producer Acc (%)</w:t>
             </w:r>
           </w:p>
         </w:tc>
         <w:tc>
           <w:tcPr>
-            <w:tcW w:w="1728" w:type="dxa"/>
+            <w:tcW w:w="1874" w:type="dxa"/>
           </w:tcPr>
           <w:p>
             <w:r>
               <w:rPr>
                 <w:b/>
               </w:rPr>
-              <w:lastRenderedPageBreak/>
               <w:t>User Acc (%)</w:t>
             </w:r>
           </w:p>
         </w:tc>
         <w:tc>
           <w:tcPr>
-            <w:tcW w:w="1728" w:type="dxa"/>
+            <w:tcW w:w="1874" w:type="dxa"/>
           </w:tcPr>
           <w:p>
             <w:r>
@@ -312,7 +310,7 @@
         </w:tc>
         <w:tc>
           <w:tcPr>
-            <w:tcW w:w="1728" w:type="dxa"/>
+            <w:tcW w:w="1874" w:type="dxa"/>
           </w:tcPr>
           <w:p>
             <w:r>
@@ -325,9 +323,12 @@
         </w:tc>
       </w:tr>
       <w:tr>
+        <w:trPr>
+          <w:trHeight w:val="372"/>
+        </w:trPr>
         <w:tc>
           <w:tcPr>
-            <w:tcW w:w="1728" w:type="dxa"/>
+            <w:tcW w:w="1874" w:type="dxa"/>
           </w:tcPr>
           <w:p>
             <w:r>
@@ -337,7 +338,7 @@
         </w:tc>
         <w:tc>
           <w:tcPr>
-            <w:tcW w:w="1728" w:type="dxa"/>
+            <w:tcW w:w="1874" w:type="dxa"/>
           </w:tcPr>
           <w:p>
             <w:r>
@@ -347,7 +348,7 @@
         </w:tc>
         <w:tc>
           <w:tcPr>
-            <w:tcW w:w="1728" w:type="dxa"/>
+            <w:tcW w:w="1874" w:type="dxa"/>
           </w:tcPr>
           <w:p>
             <w:r>
@@ -357,7 +358,7 @@
         </w:tc>
         <w:tc>
           <w:tcPr>
-            <w:tcW w:w="1728" w:type="dxa"/>
+            <w:tcW w:w="1874" w:type="dxa"/>
           </w:tcPr>
           <w:p>
             <w:r>
@@ -367,7 +368,7 @@
         </w:tc>
         <w:tc>
           <w:tcPr>
-            <w:tcW w:w="1728" w:type="dxa"/>
+            <w:tcW w:w="1874" w:type="dxa"/>
           </w:tcPr>
           <w:p>
             <w:r>
@@ -377,9 +378,12 @@
         </w:tc>
       </w:tr>
       <w:tr>
+        <w:trPr>
+          <w:trHeight w:val="356"/>
+        </w:trPr>
         <w:tc>
           <w:tcPr>
-            <w:tcW w:w="1728" w:type="dxa"/>
+            <w:tcW w:w="1874" w:type="dxa"/>
           </w:tcPr>
           <w:p>
             <w:r>
@@ -389,7 +393,7 @@
         </w:tc>
         <w:tc>
           <w:tcPr>
-            <w:tcW w:w="1728" w:type="dxa"/>
+            <w:tcW w:w="1874" w:type="dxa"/>
           </w:tcPr>
           <w:p>
             <w:r>
@@ -399,7 +403,7 @@
         </w:tc>
         <w:tc>
           <w:tcPr>
-            <w:tcW w:w="1728" w:type="dxa"/>
+            <w:tcW w:w="1874" w:type="dxa"/>
           </w:tcPr>
           <w:p>
             <w:r>
@@ -409,7 +413,7 @@
         </w:tc>
         <w:tc>
           <w:tcPr>
-            <w:tcW w:w="1728" w:type="dxa"/>
+            <w:tcW w:w="1874" w:type="dxa"/>
           </w:tcPr>
           <w:p>
             <w:r>
@@ -419,7 +423,7 @@
         </w:tc>
         <w:tc>
           <w:tcPr>
-            <w:tcW w:w="1728" w:type="dxa"/>
+            <w:tcW w:w="1874" w:type="dxa"/>
           </w:tcPr>
           <w:p>
             <w:r>
@@ -429,9 +433,12 @@
         </w:tc>
       </w:tr>
       <w:tr>
+        <w:trPr>
+          <w:trHeight w:val="372"/>
+        </w:trPr>
         <w:tc>
           <w:tcPr>
-            <w:tcW w:w="1728" w:type="dxa"/>
+            <w:tcW w:w="1874" w:type="dxa"/>
           </w:tcPr>
           <w:p>
             <w:r>
@@ -441,7 +448,7 @@
         </w:tc>
         <w:tc>
           <w:tcPr>
-            <w:tcW w:w="1728" w:type="dxa"/>
+            <w:tcW w:w="1874" w:type="dxa"/>
           </w:tcPr>
           <w:p>
             <w:r>
@@ -451,7 +458,7 @@
         </w:tc>
         <w:tc>
           <w:tcPr>
-            <w:tcW w:w="1728" w:type="dxa"/>
+            <w:tcW w:w="1874" w:type="dxa"/>
           </w:tcPr>
           <w:p>
             <w:r>
@@ -461,7 +468,7 @@
         </w:tc>
         <w:tc>
           <w:tcPr>
-            <w:tcW w:w="1728" w:type="dxa"/>
+            <w:tcW w:w="1874" w:type="dxa"/>
           </w:tcPr>
           <w:p>
             <w:r>
@@ -471,7 +478,7 @@
         </w:tc>
         <w:tc>
           <w:tcPr>
-            <w:tcW w:w="1728" w:type="dxa"/>
+            <w:tcW w:w="1874" w:type="dxa"/>
           </w:tcPr>
           <w:p>
             <w:r>
@@ -481,9 +488,12 @@
         </w:tc>
       </w:tr>
       <w:tr>
+        <w:trPr>
+          <w:trHeight w:val="372"/>
+        </w:trPr>
         <w:tc>
           <w:tcPr>
-            <w:tcW w:w="1728" w:type="dxa"/>
+            <w:tcW w:w="1874" w:type="dxa"/>
           </w:tcPr>
           <w:p>
             <w:r>
@@ -493,7 +503,7 @@
         </w:tc>
         <w:tc>
           <w:tcPr>
-            <w:tcW w:w="1728" w:type="dxa"/>
+            <w:tcW w:w="1874" w:type="dxa"/>
           </w:tcPr>
           <w:p>
             <w:r>
@@ -503,7 +513,7 @@
         </w:tc>
         <w:tc>
           <w:tcPr>
-            <w:tcW w:w="1728" w:type="dxa"/>
+            <w:tcW w:w="1874" w:type="dxa"/>
           </w:tcPr>
           <w:p>
             <w:r>
@@ -513,7 +523,7 @@
         </w:tc>
         <w:tc>
           <w:tcPr>
-            <w:tcW w:w="1728" w:type="dxa"/>
+            <w:tcW w:w="1874" w:type="dxa"/>
           </w:tcPr>
           <w:p>
             <w:r>
@@ -523,7 +533,7 @@
         </w:tc>
         <w:tc>
           <w:tcPr>
-            <w:tcW w:w="1728" w:type="dxa"/>
+            <w:tcW w:w="1874" w:type="dxa"/>
           </w:tcPr>
           <w:p>
             <w:r>
@@ -533,9 +543,12 @@
         </w:tc>
       </w:tr>
       <w:tr>
+        <w:trPr>
+          <w:trHeight w:val="372"/>
+        </w:trPr>
         <w:tc>
           <w:tcPr>
-            <w:tcW w:w="1728" w:type="dxa"/>
+            <w:tcW w:w="1874" w:type="dxa"/>
           </w:tcPr>
           <w:p>
             <w:r>
@@ -545,7 +558,7 @@
         </w:tc>
         <w:tc>
           <w:tcPr>
-            <w:tcW w:w="1728" w:type="dxa"/>
+            <w:tcW w:w="1874" w:type="dxa"/>
           </w:tcPr>
           <w:p>
             <w:r>
@@ -555,7 +568,7 @@
         </w:tc>
         <w:tc>
           <w:tcPr>
-            <w:tcW w:w="1728" w:type="dxa"/>
+            <w:tcW w:w="1874" w:type="dxa"/>
           </w:tcPr>
           <w:p>
             <w:r>
@@ -565,7 +578,7 @@
         </w:tc>
         <w:tc>
           <w:tcPr>
-            <w:tcW w:w="1728" w:type="dxa"/>
+            <w:tcW w:w="1874" w:type="dxa"/>
           </w:tcPr>
           <w:p>
             <w:r>
@@ -575,7 +588,7 @@
         </w:tc>
         <w:tc>
           <w:tcPr>
-            <w:tcW w:w="1728" w:type="dxa"/>
+            <w:tcW w:w="1874" w:type="dxa"/>
           </w:tcPr>
           <w:p>
             <w:r>
@@ -601,20 +614,23 @@
     <w:tbl>
       <w:tblPr>
         <w:tblStyle w:val="TableGrid"/>
-        <w:tblW w:w="0" w:type="auto"/>
+        <w:tblW w:w="9745" w:type="dxa"/>
         <w:tblLook w:val="04A0" w:firstRow="1" w:lastRow="0" w:firstColumn="1" w:lastColumn="0" w:noHBand="0" w:noVBand="1"/>
       </w:tblPr>
       <w:tblGrid>
-        <w:gridCol w:w="1728"/>
-        <w:gridCol w:w="1728"/>
-        <w:gridCol w:w="1728"/>
-        <w:gridCol w:w="1728"/>
-        <w:gridCol w:w="1728"/>
+        <w:gridCol w:w="1949"/>
+        <w:gridCol w:w="1949"/>
+        <w:gridCol w:w="1949"/>
+        <w:gridCol w:w="1949"/>
+        <w:gridCol w:w="1949"/>
       </w:tblGrid>
       <w:tr>
+        <w:trPr>
+          <w:trHeight w:val="1189"/>
+        </w:trPr>
         <w:tc>
           <w:tcPr>
-            <w:tcW w:w="1728" w:type="dxa"/>
+            <w:tcW w:w="1949" w:type="dxa"/>
           </w:tcPr>
           <w:p>
             <w:r>
@@ -627,7 +643,7 @@
         </w:tc>
         <w:tc>
           <w:tcPr>
-            <w:tcW w:w="1728" w:type="dxa"/>
+            <w:tcW w:w="1949" w:type="dxa"/>
           </w:tcPr>
           <w:p>
             <w:r>
@@ -640,7 +656,7 @@
         </w:tc>
         <w:tc>
           <w:tcPr>
-            <w:tcW w:w="1728" w:type="dxa"/>
+            <w:tcW w:w="1949" w:type="dxa"/>
           </w:tcPr>
           <w:p>
             <w:r>
@@ -653,7 +669,7 @@
         </w:tc>
         <w:tc>
           <w:tcPr>
-            <w:tcW w:w="1728" w:type="dxa"/>
+            <w:tcW w:w="1949" w:type="dxa"/>
           </w:tcPr>
           <w:p>
             <w:r>
@@ -666,7 +682,7 @@
         </w:tc>
         <w:tc>
           <w:tcPr>
-            <w:tcW w:w="1728" w:type="dxa"/>
+            <w:tcW w:w="1949" w:type="dxa"/>
           </w:tcPr>
           <w:p>
             <w:r>
@@ -679,9 +695,12 @@
         </w:tc>
       </w:tr>
       <w:tr>
+        <w:trPr>
+          <w:trHeight w:val="593"/>
+        </w:trPr>
         <w:tc>
           <w:tcPr>
-            <w:tcW w:w="1728" w:type="dxa"/>
+            <w:tcW w:w="1949" w:type="dxa"/>
           </w:tcPr>
           <w:p>
             <w:r>
@@ -691,7 +710,7 @@
         </w:tc>
         <w:tc>
           <w:tcPr>
-            <w:tcW w:w="1728" w:type="dxa"/>
+            <w:tcW w:w="1949" w:type="dxa"/>
           </w:tcPr>
           <w:p>
             <w:r>
@@ -701,7 +720,7 @@
         </w:tc>
         <w:tc>
           <w:tcPr>
-            <w:tcW w:w="1728" w:type="dxa"/>
+            <w:tcW w:w="1949" w:type="dxa"/>
           </w:tcPr>
           <w:p>
             <w:r>
@@ -711,7 +730,7 @@
         </w:tc>
         <w:tc>
           <w:tcPr>
-            <w:tcW w:w="1728" w:type="dxa"/>
+            <w:tcW w:w="1949" w:type="dxa"/>
           </w:tcPr>
           <w:p>
             <w:r>
@@ -721,7 +740,7 @@
         </w:tc>
         <w:tc>
           <w:tcPr>
-            <w:tcW w:w="1728" w:type="dxa"/>
+            <w:tcW w:w="1949" w:type="dxa"/>
           </w:tcPr>
           <w:p>
             <w:r>
@@ -731,9 +750,12 @@
         </w:tc>
       </w:tr>
       <w:tr>
+        <w:trPr>
+          <w:trHeight w:val="568"/>
+        </w:trPr>
         <w:tc>
           <w:tcPr>
-            <w:tcW w:w="1728" w:type="dxa"/>
+            <w:tcW w:w="1949" w:type="dxa"/>
           </w:tcPr>
           <w:p>
             <w:r>
@@ -743,7 +765,7 @@
         </w:tc>
         <w:tc>
           <w:tcPr>
-            <w:tcW w:w="1728" w:type="dxa"/>
+            <w:tcW w:w="1949" w:type="dxa"/>
           </w:tcPr>
           <w:p>
             <w:r>
@@ -753,7 +775,7 @@
         </w:tc>
         <w:tc>
           <w:tcPr>
-            <w:tcW w:w="1728" w:type="dxa"/>
+            <w:tcW w:w="1949" w:type="dxa"/>
           </w:tcPr>
           <w:p>
             <w:r>
@@ -763,7 +785,7 @@
         </w:tc>
         <w:tc>
           <w:tcPr>
-            <w:tcW w:w="1728" w:type="dxa"/>
+            <w:tcW w:w="1949" w:type="dxa"/>
           </w:tcPr>
           <w:p>
             <w:r>
@@ -773,7 +795,7 @@
         </w:tc>
         <w:tc>
           <w:tcPr>
-            <w:tcW w:w="1728" w:type="dxa"/>
+            <w:tcW w:w="1949" w:type="dxa"/>
           </w:tcPr>
           <w:p>
             <w:r>
@@ -783,9 +805,12 @@
         </w:tc>
       </w:tr>
       <w:tr>
+        <w:trPr>
+          <w:trHeight w:val="593"/>
+        </w:trPr>
         <w:tc>
           <w:tcPr>
-            <w:tcW w:w="1728" w:type="dxa"/>
+            <w:tcW w:w="1949" w:type="dxa"/>
           </w:tcPr>
           <w:p>
             <w:r>
@@ -795,7 +820,7 @@
         </w:tc>
         <w:tc>
           <w:tcPr>
-            <w:tcW w:w="1728" w:type="dxa"/>
+            <w:tcW w:w="1949" w:type="dxa"/>
           </w:tcPr>
           <w:p>
             <w:r>
@@ -805,7 +830,7 @@
         </w:tc>
         <w:tc>
           <w:tcPr>
-            <w:tcW w:w="1728" w:type="dxa"/>
+            <w:tcW w:w="1949" w:type="dxa"/>
           </w:tcPr>
           <w:p>
             <w:r>
@@ -815,7 +840,7 @@
         </w:tc>
         <w:tc>
           <w:tcPr>
-            <w:tcW w:w="1728" w:type="dxa"/>
+            <w:tcW w:w="1949" w:type="dxa"/>
           </w:tcPr>
           <w:p>
             <w:r>
@@ -825,7 +850,7 @@
         </w:tc>
         <w:tc>
           <w:tcPr>
-            <w:tcW w:w="1728" w:type="dxa"/>
+            <w:tcW w:w="1949" w:type="dxa"/>
           </w:tcPr>
           <w:p>
             <w:r>
@@ -835,6 +860,7 @@
         </w:tc>
       </w:tr>
     </w:tbl>
+    <w:bookmarkEnd w:id="0"/>
     <w:p>
       <w:r>
         <w:br/>
@@ -864,21 +890,24 @@
     <w:tbl>
       <w:tblPr>
         <w:tblStyle w:val="TableGrid"/>
-        <w:tblW w:w="0" w:type="auto"/>
+        <w:tblW w:w="9732" w:type="dxa"/>
         <w:tblLook w:val="04A0" w:firstRow="1" w:lastRow="0" w:firstColumn="1" w:lastColumn="0" w:noHBand="0" w:noVBand="1"/>
       </w:tblPr>
       <w:tblGrid>
-        <w:gridCol w:w="1440"/>
-        <w:gridCol w:w="1440"/>
-        <w:gridCol w:w="1440"/>
-        <w:gridCol w:w="1440"/>
-        <w:gridCol w:w="1440"/>
-        <w:gridCol w:w="1440"/>
+        <w:gridCol w:w="1622"/>
+        <w:gridCol w:w="1622"/>
+        <w:gridCol w:w="1622"/>
+        <w:gridCol w:w="1622"/>
+        <w:gridCol w:w="1622"/>
+        <w:gridCol w:w="1622"/>
       </w:tblGrid>
       <w:tr>
+        <w:trPr>
+          <w:trHeight w:val="1000"/>
+        </w:trPr>
         <w:tc>
           <w:tcPr>
-            <w:tcW w:w="1440" w:type="dxa"/>
+            <w:tcW w:w="1622" w:type="dxa"/>
           </w:tcPr>
           <w:p>
             <w:r>
@@ -891,7 +920,7 @@
         </w:tc>
         <w:tc>
           <w:tcPr>
-            <w:tcW w:w="1440" w:type="dxa"/>
+            <w:tcW w:w="1622" w:type="dxa"/>
           </w:tcPr>
           <w:p>
             <w:r>
@@ -904,7 +933,7 @@
         </w:tc>
         <w:tc>
           <w:tcPr>
-            <w:tcW w:w="1440" w:type="dxa"/>
+            <w:tcW w:w="1622" w:type="dxa"/>
           </w:tcPr>
           <w:p>
             <w:r>
@@ -917,7 +946,7 @@
         </w:tc>
         <w:tc>
           <w:tcPr>
-            <w:tcW w:w="1440" w:type="dxa"/>
+            <w:tcW w:w="1622" w:type="dxa"/>
           </w:tcPr>
           <w:p>
             <w:r>
@@ -930,7 +959,7 @@
         </w:tc>
         <w:tc>
           <w:tcPr>
-            <w:tcW w:w="1440" w:type="dxa"/>
+            <w:tcW w:w="1622" w:type="dxa"/>
           </w:tcPr>
           <w:p>
             <w:r>
@@ -943,7 +972,7 @@
         </w:tc>
         <w:tc>
           <w:tcPr>
-            <w:tcW w:w="1440" w:type="dxa"/>
+            <w:tcW w:w="1622" w:type="dxa"/>
           </w:tcPr>
           <w:p>
             <w:r>
@@ -956,9 +985,12 @@
         </w:tc>
       </w:tr>
       <w:tr>
+        <w:trPr>
+          <w:trHeight w:val="499"/>
+        </w:trPr>
         <w:tc>
           <w:tcPr>
-            <w:tcW w:w="1440" w:type="dxa"/>
+            <w:tcW w:w="1622" w:type="dxa"/>
           </w:tcPr>
           <w:p>
             <w:r>
@@ -968,7 +1000,7 @@
         </w:tc>
         <w:tc>
           <w:tcPr>
-            <w:tcW w:w="1440" w:type="dxa"/>
+            <w:tcW w:w="1622" w:type="dxa"/>
           </w:tcPr>
           <w:p>
             <w:r>
@@ -978,7 +1010,7 @@
         </w:tc>
         <w:tc>
           <w:tcPr>
-            <w:tcW w:w="1440" w:type="dxa"/>
+            <w:tcW w:w="1622" w:type="dxa"/>
           </w:tcPr>
           <w:p>
             <w:r>
@@ -988,7 +1020,7 @@
         </w:tc>
         <w:tc>
           <w:tcPr>
-            <w:tcW w:w="1440" w:type="dxa"/>
+            <w:tcW w:w="1622" w:type="dxa"/>
           </w:tcPr>
           <w:p>
             <w:r>
@@ -998,7 +1030,7 @@
         </w:tc>
         <w:tc>
           <w:tcPr>
-            <w:tcW w:w="1440" w:type="dxa"/>
+            <w:tcW w:w="1622" w:type="dxa"/>
           </w:tcPr>
           <w:p>
             <w:r>
@@ -1008,7 +1040,7 @@
         </w:tc>
         <w:tc>
           <w:tcPr>
-            <w:tcW w:w="1440" w:type="dxa"/>
+            <w:tcW w:w="1622" w:type="dxa"/>
           </w:tcPr>
           <w:p>
             <w:r>
@@ -1018,9 +1050,12 @@
         </w:tc>
       </w:tr>
       <w:tr>
+        <w:trPr>
+          <w:trHeight w:val="478"/>
+        </w:trPr>
         <w:tc>
           <w:tcPr>
-            <w:tcW w:w="1440" w:type="dxa"/>
+            <w:tcW w:w="1622" w:type="dxa"/>
           </w:tcPr>
           <w:p>
             <w:r>
@@ -1030,7 +1065,7 @@
         </w:tc>
         <w:tc>
           <w:tcPr>
-            <w:tcW w:w="1440" w:type="dxa"/>
+            <w:tcW w:w="1622" w:type="dxa"/>
           </w:tcPr>
           <w:p>
             <w:r>
@@ -1040,7 +1075,7 @@
         </w:tc>
         <w:tc>
           <w:tcPr>
-            <w:tcW w:w="1440" w:type="dxa"/>
+            <w:tcW w:w="1622" w:type="dxa"/>
           </w:tcPr>
           <w:p>
             <w:r>
@@ -1050,7 +1085,7 @@
         </w:tc>
         <w:tc>
           <w:tcPr>
-            <w:tcW w:w="1440" w:type="dxa"/>
+            <w:tcW w:w="1622" w:type="dxa"/>
           </w:tcPr>
           <w:p>
             <w:r>
@@ -1060,7 +1095,7 @@
         </w:tc>
         <w:tc>
           <w:tcPr>
-            <w:tcW w:w="1440" w:type="dxa"/>
+            <w:tcW w:w="1622" w:type="dxa"/>
           </w:tcPr>
           <w:p>
             <w:r>
@@ -1070,7 +1105,7 @@
         </w:tc>
         <w:tc>
           <w:tcPr>
-            <w:tcW w:w="1440" w:type="dxa"/>
+            <w:tcW w:w="1622" w:type="dxa"/>
           </w:tcPr>
           <w:p>
             <w:r>
@@ -1080,9 +1115,12 @@
         </w:tc>
       </w:tr>
       <w:tr>
+        <w:trPr>
+          <w:trHeight w:val="499"/>
+        </w:trPr>
         <w:tc>
           <w:tcPr>
-            <w:tcW w:w="1440" w:type="dxa"/>
+            <w:tcW w:w="1622" w:type="dxa"/>
           </w:tcPr>
           <w:p>
             <w:r>
@@ -1092,7 +1130,7 @@
         </w:tc>
         <w:tc>
           <w:tcPr>
-            <w:tcW w:w="1440" w:type="dxa"/>
+            <w:tcW w:w="1622" w:type="dxa"/>
           </w:tcPr>
           <w:p>
             <w:r>
@@ -1102,7 +1140,7 @@
         </w:tc>
         <w:tc>
           <w:tcPr>
-            <w:tcW w:w="1440" w:type="dxa"/>
+            <w:tcW w:w="1622" w:type="dxa"/>
           </w:tcPr>
           <w:p>
             <w:r>
@@ -1112,7 +1150,7 @@
         </w:tc>
         <w:tc>
           <w:tcPr>
-            <w:tcW w:w="1440" w:type="dxa"/>
+            <w:tcW w:w="1622" w:type="dxa"/>
           </w:tcPr>
           <w:p>
             <w:r>
@@ -1122,7 +1160,7 @@
         </w:tc>
         <w:tc>
           <w:tcPr>
-            <w:tcW w:w="1440" w:type="dxa"/>
+            <w:tcW w:w="1622" w:type="dxa"/>
           </w:tcPr>
           <w:p>
             <w:r>
@@ -1132,7 +1170,7 @@
         </w:tc>
         <w:tc>
           <w:tcPr>
-            <w:tcW w:w="1440" w:type="dxa"/>
+            <w:tcW w:w="1622" w:type="dxa"/>
           </w:tcPr>
           <w:p>
             <w:r>
@@ -1142,9 +1180,12 @@
         </w:tc>
       </w:tr>
       <w:tr>
+        <w:trPr>
+          <w:trHeight w:val="499"/>
+        </w:trPr>
         <w:tc>
           <w:tcPr>
-            <w:tcW w:w="1440" w:type="dxa"/>
+            <w:tcW w:w="1622" w:type="dxa"/>
           </w:tcPr>
           <w:p>
             <w:r>
@@ -1154,7 +1195,7 @@
         </w:tc>
         <w:tc>
           <w:tcPr>
-            <w:tcW w:w="1440" w:type="dxa"/>
+            <w:tcW w:w="1622" w:type="dxa"/>
           </w:tcPr>
           <w:p>
             <w:r>
@@ -1164,7 +1205,7 @@
         </w:tc>
         <w:tc>
           <w:tcPr>
-            <w:tcW w:w="1440" w:type="dxa"/>
+            <w:tcW w:w="1622" w:type="dxa"/>
           </w:tcPr>
           <w:p>
             <w:r>
@@ -1174,7 +1215,7 @@
         </w:tc>
         <w:tc>
           <w:tcPr>
-            <w:tcW w:w="1440" w:type="dxa"/>
+            <w:tcW w:w="1622" w:type="dxa"/>
           </w:tcPr>
           <w:p>
             <w:r>
@@ -1184,7 +1225,7 @@
         </w:tc>
         <w:tc>
           <w:tcPr>
-            <w:tcW w:w="1440" w:type="dxa"/>
+            <w:tcW w:w="1622" w:type="dxa"/>
           </w:tcPr>
           <w:p>
             <w:r>
@@ -1194,7 +1235,7 @@
         </w:tc>
         <w:tc>
           <w:tcPr>
-            <w:tcW w:w="1440" w:type="dxa"/>
+            <w:tcW w:w="1622" w:type="dxa"/>
           </w:tcPr>
           <w:p>
             <w:r>
@@ -1204,11 +1245,7 @@
         </w:tc>
       </w:tr>
     </w:tbl>
-    <w:p>
-      <w:r>
-        <w:br/>
-      </w:r>
-    </w:p>
+    <w:p/>
     <w:sectPr>
       <w:pgSz w:w="12240" w:h="15840"/>
       <w:pgMar w:top="1440" w:right="1800" w:bottom="1440" w:left="1800" w:header="720" w:footer="720" w:gutter="0"/>

</xml_diff>